<commit_message>
docs: weekly report 2026-10-27
</commit_message>
<xml_diff>
--- a/docs/reports/hisobot-2026-10-26.docx
+++ b/docs/reports/hisobot-2026-10-26.docx
@@ -101,7 +101,7 @@
         <w:spacing w:after="80"/>
       </w:pPr>
       <w:r>
-        <w:t xml:space="preserve">25-noyabr 2026: «Tashkent International Tourism Fair TITF (25–27 November 2026)» — voqeadan keyin 7 kunlik Vikipediya reaksiyasi avtomatik o'lchanadi; rasmiy oylik natija keyingi oy statistikasidan so'ng chiqadi.</w:t>
+        <w:t xml:space="preserve">27-oktabr 2026: «Urganç va Xiva o'rtasida yangi trolleybuslar qatnovi yo'lga qo'yilmoqda» — voqeadan keyin 7 kunlik Vikipediya reaksiyasi avtomatik o'lchanadi; rasmiy oylik natija keyingi oy statistikasidan so'ng chiqadi.</w:t>
       </w:r>
     </w:p>
     <w:p>
@@ -114,7 +114,7 @@
         <w:spacing w:after="80"/>
       </w:pPr>
       <w:r>
-        <w:t xml:space="preserve">1 ta yangilik tasdiq kutmoqda — botda ✅ yoki ❌ bosing.</w:t>
+        <w:t xml:space="preserve">25-noyabr 2026: «Tashkent International Tourism Fair TITF (25–27 November 2026)» — voqeadan keyin 7 kunlik Vikipediya reaksiyasi avtomatik o'lchanadi; rasmiy oylik natija keyingi oy statistikasidan so'ng chiqadi.</w:t>
       </w:r>
     </w:p>
     <w:p>
@@ -5947,6 +5947,133 @@
                 <w:sz w:val="18"/>
                 <w:szCs w:val="18"/>
               </w:rPr>
+              <w:t xml:space="preserve">27-oktabr 2026</w:t>
+            </w:r>
+          </w:p>
+        </w:tc>
+        <w:tc>
+          <w:tcPr>
+            <w:tcW w:type="dxa" w:w="3962"/>
+            <w:tcMar>
+              <w:top w:type="dxa" w:w="40"/>
+              <w:left w:type="dxa" w:w="70"/>
+              <w:bottom w:type="dxa" w:w="40"/>
+              <w:right w:type="dxa" w:w="70"/>
+            </w:tcMar>
+          </w:tcPr>
+          <w:p>
+            <w:pPr>
+              <w:jc w:val="left"/>
+            </w:pPr>
+            <w:r>
+              <w:rPr>
+                <w:b w:val="false"/>
+                <w:bCs w:val="false"/>
+                <w:sz w:val="18"/>
+                <w:szCs w:val="18"/>
+              </w:rPr>
+              <w:t xml:space="preserve">Urganç va Xiva o'rtasida yangi trolleybuslar qatnovi yo'lga qo'yilmoqda</w:t>
+            </w:r>
+          </w:p>
+        </w:tc>
+        <w:tc>
+          <w:tcPr>
+            <w:tcW w:type="dxa" w:w="1177"/>
+            <w:tcMar>
+              <w:top w:type="dxa" w:w="40"/>
+              <w:left w:type="dxa" w:w="70"/>
+              <w:bottom w:type="dxa" w:w="40"/>
+              <w:right w:type="dxa" w:w="70"/>
+            </w:tcMar>
+          </w:tcPr>
+          <w:p>
+            <w:pPr>
+              <w:jc w:val="left"/>
+            </w:pPr>
+            <w:r>
+              <w:rPr>
+                <w:b w:val="false"/>
+                <w:bCs w:val="false"/>
+                <w:sz w:val="18"/>
+                <w:szCs w:val="18"/>
+              </w:rPr>
+              <w:t xml:space="preserve">infratuzilma</w:t>
+            </w:r>
+          </w:p>
+        </w:tc>
+        <w:tc>
+          <w:tcPr>
+            <w:tcW w:type="dxa" w:w="1338"/>
+            <w:tcMar>
+              <w:top w:type="dxa" w:w="40"/>
+              <w:left w:type="dxa" w:w="70"/>
+              <w:bottom w:type="dxa" w:w="40"/>
+              <w:right w:type="dxa" w:w="70"/>
+            </w:tcMar>
+          </w:tcPr>
+          <w:p>
+            <w:pPr>
+              <w:jc w:val="left"/>
+            </w:pPr>
+            <w:r>
+              <w:rPr>
+                <w:b w:val="false"/>
+                <w:bCs w:val="false"/>
+                <w:sz w:val="18"/>
+                <w:szCs w:val="18"/>
+              </w:rPr>
+              <w:t xml:space="preserve">~4% (0/16)</w:t>
+            </w:r>
+          </w:p>
+        </w:tc>
+        <w:tc>
+          <w:tcPr>
+            <w:tcW w:type="dxa" w:w="1341"/>
+            <w:tcMar>
+              <w:top w:type="dxa" w:w="40"/>
+              <w:left w:type="dxa" w:w="70"/>
+              <w:bottom w:type="dxa" w:w="40"/>
+              <w:right w:type="dxa" w:w="70"/>
+            </w:tcMar>
+          </w:tcPr>
+          <w:p>
+            <w:pPr>
+              <w:jc w:val="left"/>
+            </w:pPr>
+            <w:r>
+              <w:rPr>
+                <w:b w:val="false"/>
+                <w:bCs w:val="false"/>
+                <w:sz w:val="18"/>
+                <w:szCs w:val="18"/>
+              </w:rPr>
+              <w:t xml:space="preserve">ma'lumot kam</w:t>
+            </w:r>
+          </w:p>
+        </w:tc>
+      </w:tr>
+      <w:tr>
+        <w:tc>
+          <w:tcPr>
+            <w:tcW w:type="dxa" w:w="1820"/>
+            <w:tcMar>
+              <w:top w:type="dxa" w:w="40"/>
+              <w:left w:type="dxa" w:w="70"/>
+              <w:bottom w:type="dxa" w:w="40"/>
+              <w:right w:type="dxa" w:w="70"/>
+            </w:tcMar>
+          </w:tcPr>
+          <w:p>
+            <w:pPr>
+              <w:jc w:val="left"/>
+            </w:pPr>
+            <w:r>
+              <w:rPr>
+                <w:b w:val="false"/>
+                <w:bCs w:val="false"/>
+                <w:sz w:val="18"/>
+                <w:szCs w:val="18"/>
+              </w:rPr>
               <w:t xml:space="preserve">25-noyabr 2026</w:t>
             </w:r>
           </w:p>
@@ -6090,7 +6217,7 @@
           <w:i w:val="false"/>
           <w:iCs w:val="false"/>
         </w:rPr>
-        <w:t xml:space="preserve">AI tanlagan yangiliklar: 8 ta — kanalga chiqqan: 7, rad etilgan: 0, tasdiq kutmoqda: 1.</w:t>
+        <w:t xml:space="preserve">AI tanlagan yangiliklar: 8 ta — kanalga chiqqan: 8, rad etilgan: 0, tasdiq kutmoqda: 0.</w:t>
       </w:r>
     </w:p>
     <w:p>
@@ -6182,6 +6309,19 @@
       </w:pPr>
       <w:r>
         <w:t xml:space="preserve">▲ Shvesiyada O'zbekistonning turizm salohiyati taqdim etildi (26.10)</w:t>
+      </w:r>
+    </w:p>
+    <w:p>
+      <w:pPr>
+        <w:pStyle w:val="ListParagraph"/>
+        <w:numPr>
+          <w:ilvl w:val="0"/>
+          <w:numId w:val="2"/>
+        </w:numPr>
+        <w:spacing w:after="80"/>
+      </w:pPr>
+      <w:r>
+        <w:t xml:space="preserve">▲ Urganç va Xiva o'rtasida yangi trolleybuslar qatnovi yo'lga qo'yilmoqda (27.10)</w:t>
       </w:r>
     </w:p>
     <w:p>

</xml_diff>